<commit_message>
feat(slides): deck PDFs + presenter notes
- tools/decks_to_pdf.mjs + build_slides_html.py --pdf → slides/pdf/*.pdf
  (one page per slide, 33.8×19 cm, page-size honoured via preferCSSPageSize)
- build_slides.py: :::notes blocks → PPTX speaker notes (presenter view);
  session brief (timing, objectives, focus points, board questions) added to
  the title slide of each of the six decks
- source/slides/README.md documents :::notes and the three output formats
- trainer guide checklist + README updated for PPTX/HTML/PDF delivery

Co-authored-by: arena-agent <297053741+arena-agent@users.noreply.github.com>
</commit_message>
<xml_diff>
--- a/docx/trainer-guide.docx
+++ b/docx/trainer-guide.docx
@@ -2558,7 +2558,110 @@
           <w:sz w:val="22"/>
           <w:rtl/>
         </w:rPr>
-        <w:t xml:space="preserve">(عروض جاهزة 11–18 شريحة لكل جلسة) على شاشة العرض — توزَّع Canvas لا تُطبع</w:t>
+        <w:t xml:space="preserve">على شاشة العرض — ثلاث صيغ:</w:t>
+      </w:r>
+      <w:r>
+        <w:rPr>
+          <w:sz w:val="22"/>
+          <w:rtl/>
+        </w:rPr>
+        <w:t xml:space="preserve"> </w:t>
+      </w:r>
+      <w:r>
+        <w:rPr>
+          <w:rStyle w:val="VerbatimChar"/>
+          <w:sz w:val="22"/>
+          <w:rtl/>
+        </w:rPr>
+        <w:t xml:space="preserve">*.pptx</w:t>
+      </w:r>
+      <w:r>
+        <w:rPr>
+          <w:sz w:val="22"/>
+          <w:rtl/>
+        </w:rPr>
+        <w:t xml:space="preserve"> </w:t>
+      </w:r>
+      <w:r>
+        <w:rPr>
+          <w:sz w:val="22"/>
+          <w:rtl/>
+        </w:rPr>
+        <w:t xml:space="preserve">(تعديل +</w:t>
+      </w:r>
+      <w:r>
+        <w:rPr>
+          <w:sz w:val="22"/>
+          <w:rtl/>
+        </w:rPr>
+        <w:t xml:space="preserve"> </w:t>
+      </w:r>
+      <w:r>
+        <w:rPr>
+          <w:b/>
+          <w:bCs/>
+          <w:sz w:val="22"/>
+          <w:rtl/>
+        </w:rPr>
+        <w:t xml:space="preserve">ملاحظات محاضر</w:t>
+      </w:r>
+      <w:r>
+        <w:rPr>
+          <w:sz w:val="22"/>
+          <w:rtl/>
+        </w:rPr>
+        <w:t xml:space="preserve"> </w:t>
+      </w:r>
+      <w:r>
+        <w:rPr>
+          <w:sz w:val="22"/>
+          <w:rtl/>
+        </w:rPr>
+        <w:t xml:space="preserve">في Presenter View) و</w:t>
+      </w:r>
+      <w:r>
+        <w:rPr>
+          <w:rStyle w:val="VerbatimChar"/>
+          <w:sz w:val="22"/>
+          <w:rtl/>
+        </w:rPr>
+        <w:t xml:space="preserve">html/index.html</w:t>
+      </w:r>
+      <w:r>
+        <w:rPr>
+          <w:sz w:val="22"/>
+          <w:rtl/>
+        </w:rPr>
+        <w:t xml:space="preserve"> </w:t>
+      </w:r>
+      <w:r>
+        <w:rPr>
+          <w:sz w:val="22"/>
+          <w:rtl/>
+        </w:rPr>
+        <w:t xml:space="preserve">(متصفح) و</w:t>
+      </w:r>
+      <w:r>
+        <w:rPr>
+          <w:rStyle w:val="VerbatimChar"/>
+          <w:sz w:val="22"/>
+          <w:rtl/>
+        </w:rPr>
+        <w:t xml:space="preserve">pdf/*.pdf</w:t>
+      </w:r>
+      <w:r>
+        <w:rPr>
+          <w:sz w:val="22"/>
+          <w:rtl/>
+        </w:rPr>
+        <w:t xml:space="preserve"> </w:t>
+      </w:r>
+      <w:r>
+        <w:rPr>
+          <w:sz w:val="22"/>
+          <w:rtl/>
+        </w:rPr>
+        <w:t xml:space="preserve">(عرض بلا تعديل) — توزَّع رقمياً لا تُطبع</w:t>
       </w:r>
     </w:p>
     <w:p>

</xml_diff>